<commit_message>
Rename levels P1-P6 to Level 1-6 across outputs, decks, guides, site
Co-Authored-By: Claude Sonnet 5.5 <noreply@anthropic.com>
Claude-Session: https://claude.ai/code/session_01NYgB3ju57UwWRpkPPM6X7F
</commit_message>
<xml_diff>
--- a/hp/Math_Inquirers_Lesson6_Trial_60min.docx
+++ b/hp/Math_Inquirers_Lesson6_Trial_60min.docx
@@ -16,7 +16,7 @@
           <w:sz w:val="22"/>
           <w:szCs w:val="22"/>
         </w:rPr>
-        <w:t xml:space="preserve">TRIAL LESSON  •  60 MINUTES  •  PRIMARY 1</w:t>
+        <w:t xml:space="preserve">TRIAL LESSON  •  60 MINUTES  •  LEVEL 1</w:t>
       </w:r>
     </w:p>
     <w:p>
@@ -6681,7 +6681,7 @@
                 <w:sz w:val="24"/>
                 <w:szCs w:val="24"/>
               </w:rPr>
-              <w:t xml:space="preserve">MATH INQUIRERS HOLIDAY PROGRAM  •  PRIMARY 1</w:t>
+              <w:t xml:space="preserve">MATH INQUIRERS HOLIDAY PROGRAM  •  LEVEL 1</w:t>
             </w:r>
           </w:p>
         </w:tc>

</xml_diff>

<commit_message>
Final fixes for Levels 1-4 and shared files: bank residue, Go further pictures, Puzzle Day, L1 reset, L2 kit and Q5, L4 syllabus notes, diagnostics, scheme wording
Co-Authored-By: Claude Sonnet 5.5 <noreply@anthropic.com>
Claude-Session: https://claude.ai/code/session_01Wmstm4fTDLXm5Z35vo5Mv2
</commit_message>
<xml_diff>
--- a/hp/Math_Inquirers_Lesson6_Trial_60min.docx
+++ b/hp/Math_Inquirers_Lesson6_Trial_60min.docx
@@ -1541,7 +1541,7 @@
           <w:sz w:val="21"/>
           <w:szCs w:val="21"/>
         </w:rPr>
-        <w:t xml:space="preserve">Use signals: “Pencils down” for attention, and “Show me” for pairs to hold up their whiteboard so that you can scan the room in ten seconds.</w:t>
+        <w:t xml:space="preserve">Use signals: “Pencils down” for attention, and “Show me” for each pair to show only you their whiteboard, held low, as you walk round. Nobody holds a board up in front of the class, so nobody is put on the spot.</w:t>
       </w:r>
     </w:p>
     <w:p>
@@ -9205,8 +9205,32 @@
         <w:szCs w:val="18"/>
       </w:rPr>
       <w:fldChar w:fldCharType="begin"/>
+    </w:r>
+    <w:r>
+      <w:rPr>
+        <w:rFonts w:ascii="Arial" w:cs="Arial" w:eastAsia="Arial" w:hAnsi="Arial"/>
+        <w:color w:val="777777"/>
+        <w:sz w:val="18"/>
+        <w:szCs w:val="18"/>
+      </w:rPr>
       <w:instrText xml:space="preserve">PAGE</w:instrText>
+    </w:r>
+    <w:r>
+      <w:rPr>
+        <w:rFonts w:ascii="Arial" w:cs="Arial" w:eastAsia="Arial" w:hAnsi="Arial"/>
+        <w:color w:val="777777"/>
+        <w:sz w:val="18"/>
+        <w:szCs w:val="18"/>
+      </w:rPr>
       <w:fldChar w:fldCharType="separate"/>
+    </w:r>
+    <w:r>
+      <w:rPr>
+        <w:rFonts w:ascii="Arial" w:cs="Arial" w:eastAsia="Arial" w:hAnsi="Arial"/>
+        <w:color w:val="777777"/>
+        <w:sz w:val="18"/>
+        <w:szCs w:val="18"/>
+      </w:rPr>
       <w:fldChar w:fldCharType="end"/>
     </w:r>
   </w:p>
@@ -9360,6 +9384,21 @@
   <w:style w:type="paragraph" w:styleId="Normal" w:default="1">
     <w:name w:val="Normal"/>
     <w:qFormat/>
+  </w:style>
+  <w:style w:type="table" w:styleId="TableNormal" w:default="true">
+    <w:name w:val="Normal Table"/>
+    <w:uiPriority w:val="99"/>
+    <w:semiHidden/>
+    <w:unhideWhenUsed/>
+    <w:tblPr>
+      <w:tblInd w:type="dxa" w:w="0"/>
+      <w:tblCellMar>
+        <w:top w:type="dxa" w:w="0"/>
+        <w:left w:type="dxa" w:w="108"/>
+        <w:bottom w:type="dxa" w:w="0"/>
+        <w:right w:type="dxa" w:w="108"/>
+      </w:tblCellMar>
+    </w:tblPr>
   </w:style>
   <w:style w:type="paragraph" w:styleId="Title">
     <w:name w:val="Title"/>

</xml_diff>